<commit_message>
Modificaciones a la propuesta final de Pago a Proveedores
</commit_message>
<xml_diff>
--- a/documentos/RQM Modulo de Ordenes de Pago a Proveedores/PROPUESTA - Modulo de Ordenes de Pago a Proveedores.docx
+++ b/documentos/RQM Modulo de Ordenes de Pago a Proveedores/PROPUESTA - Modulo de Ordenes de Pago a Proveedores.docx
@@ -3985,8 +3985,7 @@
         </w:numPr>
       </w:pPr>
       <w:r>
-        <w:lastRenderedPageBreak/>
-        <w:t>Por Orden de Compra: moneda, estado, fecha estimada de pago (con semáforo), valor total proforma, valor comprometido, valor ejecutado y saldo por pagar.</w:t>
+        <w:t>Por Orden de Compra: moneda, estado, fecha estimada de pago (con semáforo), valor total proforma, valor comprometido, valor ejecutado (abonos), saldo por pagar y situación de saldo.</w:t>
       </w:r>
     </w:p>
     <w:p>
@@ -4011,6 +4010,12 @@
       </w:pPr>
       <w:r>
         <w:t>Totales por Orden de Compra, por Proveedor y por Moneda (nunca se suman monedas diferentes).</w:t>
+      </w:r>
+    </w:p>
+    <w:p>
+      <w:pPr/>
+      <w:r>
+        <w:t>La situación de saldo de cada Orden de Compra se determina con los pagos ejecutados (abonos): Sin abonos, cuando no tiene pagos ejecutados; Con abono, cuando tiene pagos ejecutados y aún tiene saldo; y Pagada totalmente, cuando los pagos ejecutados cubren el valor total proforma. Las Órdenes de Pago en trámite (en creación, devueltas, en aprobación o en ejecución) se reflejan en el valor comprometido.</w:t>
       </w:r>
     </w:p>
     <w:p>
@@ -4305,7 +4310,7 @@
               <w:rPr>
                 <w:sz w:val="18"/>
               </w:rPr>
-              <w:t>Situación de saldo: Con saldo por pagar / Pagada totalmente / Sin pagos</w:t>
+              <w:t>Situación de saldo: Sin abonos / Con abono / Pagada totalmente (selección múltiple)</w:t>
             </w:r>
           </w:p>
         </w:tc>
@@ -4325,7 +4330,7 @@
               <w:rPr>
                 <w:sz w:val="18"/>
               </w:rPr>
-              <w:t>Identificar las Órdenes de Compra pendientes de pago.</w:t>
+              <w:t>Identificar las Órdenes de Compra pendientes de pago, distinguiendo las que no han recibido ningún pago de las que ya tienen abonos y aún tienen saldo.</w:t>
             </w:r>
           </w:p>
         </w:tc>
@@ -4346,7 +4351,7 @@
               <w:rPr>
                 <w:sz w:val="18"/>
               </w:rPr>
-              <w:t>Fecha estimada de pago (rango) y opción "Vencidas"</w:t>
+              <w:t>Fecha estimada de pago (rango), con atajos: Vencidas, Próximos 7 días, Próximos 15 días y Próximos 30 días</w:t>
             </w:r>
           </w:p>
         </w:tc>
@@ -4365,7 +4370,7 @@
               <w:rPr>
                 <w:sz w:val="18"/>
               </w:rPr>
-              <w:t>Planeación de flujo de caja: qué se debe pagar próximamente y qué está atrasado.</w:t>
+              <w:t>Planeación de flujo de caja: qué se debe pagar en la próxima semana, quincena o mes, y qué está atrasado.</w:t>
             </w:r>
           </w:p>
         </w:tc>

</xml_diff>